<commit_message>
Added methodology section with preprocessing, SMOTE, Random Forest, and SHAP analysis
</commit_message>
<xml_diff>
--- a/paper/draft.docx
+++ b/paper/draft.docx
@@ -121,6 +121,208 @@
     <w:p>
       <w:r>
         <w:t>3. Methodology</w:t>
+      </w:r>
+    </w:p>
+    <w:p>
+      <w:pPr>
+        <w:rPr>
+          <w:b/>
+          <w:bCs/>
+        </w:rPr>
+      </w:pPr>
+      <w:r>
+        <w:rPr>
+          <w:b/>
+          <w:bCs/>
+        </w:rPr>
+        <w:t>3.1 Dataset Description</w:t>
+      </w:r>
+    </w:p>
+    <w:p>
+      <w:r>
+        <w:t xml:space="preserve">The study utilized the publicly available Water Potability Dataset obtained from Kaggle. The dataset contains 100,000 water samples characterized using multiple physicochemical water quality parameters. The dataset includes features such as pH, hardness, total dissolved solids (TDS), chloramines, </w:t>
+      </w:r>
+      <w:proofErr w:type="spellStart"/>
+      <w:r>
+        <w:t>sulfate</w:t>
+      </w:r>
+      <w:proofErr w:type="spellEnd"/>
+      <w:r>
+        <w:t>, conductivity, organic carbon, trihalomethanes, and turbidity. The target variable, potability, represents binary classification labels indicating whether water is safe or unsafe for drinking purposes.</w:t>
+      </w:r>
+    </w:p>
+    <w:p>
+      <w:pPr>
+        <w:rPr>
+          <w:b/>
+          <w:bCs/>
+        </w:rPr>
+      </w:pPr>
+      <w:r>
+        <w:rPr>
+          <w:b/>
+          <w:bCs/>
+        </w:rPr>
+        <w:t>3.2 Data Preprocessing</w:t>
+      </w:r>
+    </w:p>
+    <w:p>
+      <w:r>
+        <w:t xml:space="preserve">Data preprocessing was performed to improve data quality and prepare the dataset for machine learning analysis. Missing values were identified in several features, including pH, TDS, </w:t>
+      </w:r>
+      <w:proofErr w:type="spellStart"/>
+      <w:r>
+        <w:t>sulfate</w:t>
+      </w:r>
+      <w:proofErr w:type="spellEnd"/>
+      <w:r>
+        <w:t>, and conductivity. Median imputation was employed to handle missing values due to the presence of skewed distributions and potential outliers within the dataset.</w:t>
+      </w:r>
+    </w:p>
+    <w:p>
+      <w:r>
+        <w:t xml:space="preserve">Exploratory Data Analysis (EDA) was conducted to </w:t>
+      </w:r>
+      <w:proofErr w:type="spellStart"/>
+      <w:r>
+        <w:t>analyze</w:t>
+      </w:r>
+      <w:proofErr w:type="spellEnd"/>
+      <w:r>
+        <w:t xml:space="preserve"> feature distributions, class imbalance, and feature correlations. Correlation heatmaps and distribution plots were generated to better understand relationships among water quality parameters. Feature scaling was subsequently applied using </w:t>
+      </w:r>
+      <w:proofErr w:type="spellStart"/>
+      <w:r>
+        <w:t>StandardScaler</w:t>
+      </w:r>
+      <w:proofErr w:type="spellEnd"/>
+      <w:r>
+        <w:t xml:space="preserve"> to normalize feature magnitudes before model training.</w:t>
+      </w:r>
+    </w:p>
+    <w:p>
+      <w:pPr>
+        <w:rPr>
+          <w:b/>
+          <w:bCs/>
+        </w:rPr>
+      </w:pPr>
+      <w:r>
+        <w:rPr>
+          <w:b/>
+          <w:bCs/>
+        </w:rPr>
+        <w:t>3.3 Class Imbalance Handling Using SMOTE</w:t>
+      </w:r>
+    </w:p>
+    <w:p>
+      <w:r>
+        <w:t>The dataset exhibited severe class imbalance, with non-potable water samples significantly outnumbering potable water samples. To address this issue, the Synthetic Minority Oversampling Technique (SMOTE) was applied to the training dataset. SMOTE generates synthetic samples for the minority class to improve model learning and reduce classification bias toward the majority class. The balancing process was performed only on the training data to avoid information leakage during model evaluation.</w:t>
+      </w:r>
+    </w:p>
+    <w:p>
+      <w:pPr>
+        <w:rPr>
+          <w:b/>
+          <w:bCs/>
+        </w:rPr>
+      </w:pPr>
+      <w:r>
+        <w:rPr>
+          <w:b/>
+          <w:bCs/>
+        </w:rPr>
+        <w:t>3.4 Machine Learning Model Development</w:t>
+      </w:r>
+    </w:p>
+    <w:p>
+      <w:r>
+        <w:t>Multiple machine learning models were implemented and evaluated for water potability prediction. Logistic Regression was used as the baseline classification model due to its simplicity and interpretability. Decision Tree classification was subsequently applied to capture non-linear relationships among water quality features.</w:t>
+      </w:r>
+    </w:p>
+    <w:p>
+      <w:r>
+        <w:t>The primary prediction model utilized in this study was the Random Forest classifier. Random Forest is an ensemble learning technique that combines multiple decision trees to improve prediction robustness and reduce overfitting. The model was trained using balanced training data generated through SMOTE preprocessing.</w:t>
+      </w:r>
+    </w:p>
+    <w:p>
+      <w:r>
+        <w:t>The dataset was divided into training and testing subsets using an 80:20 train-test split strategy with stratified sampling to preserve class distribution consistency across both subsets.</w:t>
+      </w:r>
+    </w:p>
+    <w:p>
+      <w:pPr>
+        <w:rPr>
+          <w:b/>
+          <w:bCs/>
+        </w:rPr>
+      </w:pPr>
+      <w:r>
+        <w:rPr>
+          <w:b/>
+          <w:bCs/>
+        </w:rPr>
+        <w:t>3.5 Explainability Analysis</w:t>
+      </w:r>
+    </w:p>
+    <w:p>
+      <w:r>
+        <w:lastRenderedPageBreak/>
+        <w:t>To improve model interpretability and transparency, Explainable Artificial Intelligence (XAI) techniques were integrated into the proposed framework. Feature importance analysis was initially performed using Random Forest feature importance scores. Furthermore, SHAP (</w:t>
+      </w:r>
+      <w:proofErr w:type="spellStart"/>
+      <w:r>
+        <w:t>SHapley</w:t>
+      </w:r>
+      <w:proofErr w:type="spellEnd"/>
+      <w:r>
+        <w:t xml:space="preserve"> Additive </w:t>
+      </w:r>
+      <w:proofErr w:type="spellStart"/>
+      <w:r>
+        <w:t>exPlanations</w:t>
+      </w:r>
+      <w:proofErr w:type="spellEnd"/>
+      <w:r>
+        <w:t>) analysis was conducted to quantify the contribution of individual water quality parameters toward model predictions.</w:t>
+      </w:r>
+    </w:p>
+    <w:p>
+      <w:r>
+        <w:t>The SHAP framework enabled visualization of feature-level impacts and provided interpretable insights into the factors influencing water potability prediction outcomes.</w:t>
+      </w:r>
+    </w:p>
+    <w:p>
+      <w:pPr>
+        <w:rPr>
+          <w:b/>
+          <w:bCs/>
+        </w:rPr>
+      </w:pPr>
+      <w:r>
+        <w:rPr>
+          <w:b/>
+          <w:bCs/>
+        </w:rPr>
+        <w:t>3.6 Evaluation Metrics</w:t>
+      </w:r>
+    </w:p>
+    <w:p>
+      <w:r>
+        <w:t xml:space="preserve">Model performance was evaluated using multiple classification metrics, including accuracy, precision, recall, F1-score, and cross-validation accuracy. Confusion matrices were also generated to </w:t>
+      </w:r>
+      <w:proofErr w:type="spellStart"/>
+      <w:r>
+        <w:t>analyze</w:t>
+      </w:r>
+      <w:proofErr w:type="spellEnd"/>
+      <w:r>
+        <w:t xml:space="preserve"> classification performance across potable and non-potable classes.</w:t>
+      </w:r>
+    </w:p>
+    <w:p>
+      <w:r>
+        <w:t>Cross-validation analysis was performed using five-fold cross-validation to assess the generalization capability and robustness of the proposed Random Forest model.</w:t>
       </w:r>
     </w:p>
     <w:p/>

</xml_diff>

<commit_message>
Added experimental setup section to research paper
</commit_message>
<xml_diff>
--- a/paper/draft.docx
+++ b/paper/draft.docx
@@ -331,9 +331,96 @@
         <w:t>4. Experimental Setup</w:t>
       </w:r>
     </w:p>
+    <w:p>
+      <w:r>
+        <w:t xml:space="preserve">The proposed machine learning framework was implemented using Python programming language within the Google </w:t>
+      </w:r>
+      <w:proofErr w:type="spellStart"/>
+      <w:r>
+        <w:t>Colaboratory</w:t>
+      </w:r>
+      <w:proofErr w:type="spellEnd"/>
+      <w:r>
+        <w:t xml:space="preserve"> (Google </w:t>
+      </w:r>
+      <w:proofErr w:type="spellStart"/>
+      <w:r>
+        <w:t>Colab</w:t>
+      </w:r>
+      <w:proofErr w:type="spellEnd"/>
+      <w:r>
+        <w:t>) environment. Several scientific computing and machine learning libraries were utilized during experimentation, including Pandas, NumPy, Matplotlib, Seaborn, Scikit-learn, Imbalanced-learn, and SHAP.</w:t>
+      </w:r>
+    </w:p>
+    <w:p>
+      <w:r>
+        <w:t xml:space="preserve">The Water Potability Dataset used in this study contained 100,000 samples and 10 attributes, including nine physicochemical water quality parameters and one binary target variable representing water potability status. Prior to model development, missing values were handled using median imputation, followed by feature scaling using </w:t>
+      </w:r>
+      <w:proofErr w:type="spellStart"/>
+      <w:r>
+        <w:t>StandardScaler</w:t>
+      </w:r>
+      <w:proofErr w:type="spellEnd"/>
+      <w:r>
+        <w:t>.</w:t>
+      </w:r>
+    </w:p>
+    <w:p>
+      <w:r>
+        <w:t>The dataset was partitioned into training and testing subsets using an 80:20 train-test split strategy with stratified sampling to preserve class distribution consistency. Due to the severe imbalance between potable and non-potable water samples, the Synthetic Minority Oversampling Technique (SMOTE) was applied exclusively to the training data to generate balanced class distributions.</w:t>
+      </w:r>
+    </w:p>
+    <w:p>
+      <w:r>
+        <w:t>Three machine learning models were implemented and comparatively evaluated: Logistic Regression, Decision Tree, and Random Forest classifiers. Logistic Regression served as the baseline model, while Decision Tree and Random Forest models were employed to capture non-linear relationships among water quality parameters.</w:t>
+      </w:r>
+    </w:p>
+    <w:p>
+      <w:r>
+        <w:t xml:space="preserve">Performance evaluation was conducted using multiple classification metrics, including accuracy, precision, recall, and F1-score. Confusion matrices were additionally generated to </w:t>
+      </w:r>
+      <w:proofErr w:type="spellStart"/>
+      <w:r>
+        <w:t>analyze</w:t>
+      </w:r>
+      <w:proofErr w:type="spellEnd"/>
+      <w:r>
+        <w:t xml:space="preserve"> class-wise prediction </w:t>
+      </w:r>
+      <w:proofErr w:type="spellStart"/>
+      <w:r>
+        <w:t>behavior</w:t>
+      </w:r>
+      <w:proofErr w:type="spellEnd"/>
+      <w:r>
+        <w:t>. To further validate model robustness and generalization capability, five-fold cross-validation was performed on the Random Forest classifier.</w:t>
+      </w:r>
+    </w:p>
+    <w:p>
+      <w:r>
+        <w:t>Explainability analysis was conducted using SHAP (</w:t>
+      </w:r>
+      <w:proofErr w:type="spellStart"/>
+      <w:r>
+        <w:t>SHapley</w:t>
+      </w:r>
+      <w:proofErr w:type="spellEnd"/>
+      <w:r>
+        <w:t xml:space="preserve"> Additive </w:t>
+      </w:r>
+      <w:proofErr w:type="spellStart"/>
+      <w:r>
+        <w:t>exPlanations</w:t>
+      </w:r>
+      <w:proofErr w:type="spellEnd"/>
+      <w:r>
+        <w:t>) to identify the most influential features contributing to water potability prediction. The explainability framework enabled transparent interpretation of model decisions and supported feature-level analysis of contamination-related indicators.</w:t>
+      </w:r>
+    </w:p>
     <w:p/>
     <w:p>
       <w:r>
+        <w:lastRenderedPageBreak/>
         <w:t>5. Results and Discussion</w:t>
       </w:r>
     </w:p>

</xml_diff>

<commit_message>
Added results and discussion section with Random Forest and SHAP analysis
</commit_message>
<xml_diff>
--- a/paper/draft.docx
+++ b/paper/draft.docx
@@ -422,6 +422,171 @@
       <w:r>
         <w:lastRenderedPageBreak/>
         <w:t>5. Results and Discussion</w:t>
+      </w:r>
+    </w:p>
+    <w:p>
+      <w:pPr>
+        <w:rPr>
+          <w:b/>
+          <w:bCs/>
+        </w:rPr>
+      </w:pPr>
+      <w:r>
+        <w:rPr>
+          <w:b/>
+          <w:bCs/>
+        </w:rPr>
+        <w:t>5.1 Exploratory Data Analysis</w:t>
+      </w:r>
+    </w:p>
+    <w:p>
+      <w:r>
+        <w:t xml:space="preserve">Exploratory Data Analysis (EDA) was conducted to understand the characteristics and quality of the water potability dataset prior to model development. Correlation analysis revealed relatively weak linear relationships among several physicochemical parameters and the target variable, indicating the presence of complex non-linear dependencies within the dataset. Feature distribution analysis further demonstrated skewness and outlier </w:t>
+      </w:r>
+      <w:proofErr w:type="spellStart"/>
+      <w:r>
+        <w:t>behavior</w:t>
+      </w:r>
+      <w:proofErr w:type="spellEnd"/>
+      <w:r>
+        <w:t xml:space="preserve"> in parameters such as conductivity, hardness, and total dissolved solids (TDS).</w:t>
+      </w:r>
+    </w:p>
+    <w:p>
+      <w:r>
+        <w:t>Class distribution analysis revealed severe imbalance between potable and non-potable water samples. Approximately 92% of samples belonged to the non-potable class, while only a small proportion represented potable water samples. This imbalance justified the application of the Synthetic Minority Oversampling Technique (SMOTE) during preprocessing.</w:t>
+      </w:r>
+    </w:p>
+    <w:p>
+      <w:pPr>
+        <w:rPr>
+          <w:b/>
+          <w:bCs/>
+        </w:rPr>
+      </w:pPr>
+      <w:r>
+        <w:rPr>
+          <w:b/>
+          <w:bCs/>
+        </w:rPr>
+        <w:t>5.2 Model Performance Comparison</w:t>
+      </w:r>
+    </w:p>
+    <w:p>
+      <w:r>
+        <w:t>Three machine learning models were comparatively evaluated for water potability prediction: Logistic Regression, Decision Tree, and Random Forest classifiers. Logistic Regression served as the baseline model and achieved moderate classification performance after SMOTE balancing. Although the model demonstrated relatively strong recall for potable water detection, precision performance remained comparatively lower due to the complex non-linear relationships within the dataset.</w:t>
+      </w:r>
+    </w:p>
+    <w:p>
+      <w:r>
+        <w:t>Decision Tree classification significantly improved prediction performance by effectively capturing non-linear feature interactions. The model achieved high classification accuracy and strong precision-recall balance across both classes.</w:t>
+      </w:r>
+    </w:p>
+    <w:p>
+      <w:r>
+        <w:t>Among all evaluated models, Random Forest achieved the best overall performance. The ensemble-based architecture demonstrated superior robustness and generalization capability compared to the baseline models. Experimental evaluation indicated that the Random Forest classifier achieved an accuracy of approximately 99.68%, along with high precision, recall, and F1-score values for potable water prediction.</w:t>
+      </w:r>
+    </w:p>
+    <w:p>
+      <w:r>
+        <w:t>Five-fold cross-validation further validated the robustness of the proposed Random Forest model. The model achieved an average cross-validation accuracy of approximately 99.67%, indicating strong generalization performance and reduced overfitting risk.</w:t>
+      </w:r>
+    </w:p>
+    <w:p>
+      <w:pPr>
+        <w:rPr>
+          <w:b/>
+          <w:bCs/>
+        </w:rPr>
+      </w:pPr>
+      <w:r>
+        <w:rPr>
+          <w:b/>
+          <w:bCs/>
+        </w:rPr>
+        <w:t>5.3 Confusion Matrix Analysis</w:t>
+      </w:r>
+    </w:p>
+    <w:p>
+      <w:r>
+        <w:t>Confusion matrix analysis demonstrated that the Random Forest model produced significantly fewer misclassifications compared to Logistic Regression. The model successfully minimized both false positives and false negatives, thereby improving contamination prediction reliability.</w:t>
+      </w:r>
+    </w:p>
+    <w:p>
+      <w:r>
+        <w:t>High recall performance for potable water samples is particularly important in practical early warning systems, as false negative predictions may result in unsafe water being incorrectly classified as potable. The proposed Random Forest framework demonstrated strong capability in identifying potable water samples while maintaining low classification error.</w:t>
+      </w:r>
+    </w:p>
+    <w:p>
+      <w:pPr>
+        <w:rPr>
+          <w:b/>
+          <w:bCs/>
+        </w:rPr>
+      </w:pPr>
+      <w:r>
+        <w:rPr>
+          <w:b/>
+          <w:bCs/>
+        </w:rPr>
+        <w:t>5.4 Feature Importance Analysis</w:t>
+      </w:r>
+    </w:p>
+    <w:p>
+      <w:r>
+        <w:t>Random Forest feature importance analysis identified conductivity, total dissolved solids (TDS), and trihalomethanes as the most influential parameters contributing to water potability prediction. Hardness and organic carbon also demonstrated notable predictive influence.</w:t>
+      </w:r>
+    </w:p>
+    <w:p>
+      <w:r>
+        <w:lastRenderedPageBreak/>
+        <w:t>Interestingly, pH exhibited comparatively lower feature importance than several other physicochemical parameters. This observation suggests that conductivity-related indicators and dissolved chemical content may play a more dominant role in machine learning-based water potability prediction within the utilized dataset.</w:t>
+      </w:r>
+    </w:p>
+    <w:p>
+      <w:pPr>
+        <w:rPr>
+          <w:b/>
+          <w:bCs/>
+        </w:rPr>
+      </w:pPr>
+      <w:r>
+        <w:rPr>
+          <w:b/>
+          <w:bCs/>
+        </w:rPr>
+        <w:t>5.5 SHAP Explainability Analysis</w:t>
+      </w:r>
+    </w:p>
+    <w:p>
+      <w:r>
+        <w:t>To improve interpretability and transparency, SHAP (</w:t>
+      </w:r>
+      <w:proofErr w:type="spellStart"/>
+      <w:r>
+        <w:t>SHapley</w:t>
+      </w:r>
+      <w:proofErr w:type="spellEnd"/>
+      <w:r>
+        <w:t xml:space="preserve"> Additive </w:t>
+      </w:r>
+      <w:proofErr w:type="spellStart"/>
+      <w:r>
+        <w:t>exPlanations</w:t>
+      </w:r>
+      <w:proofErr w:type="spellEnd"/>
+      <w:r>
+        <w:t>) analysis was performed on the Random Forest model. SHAP summary visualization confirmed the significance of conductivity, TDS, and trihalomethanes in influencing prediction outcomes.</w:t>
+      </w:r>
+    </w:p>
+    <w:p>
+      <w:r>
+        <w:t>The explainability analysis provided feature-level insights into how individual water quality parameters contributed toward potable and non-potable classification decisions. High conductivity and elevated dissolved solids demonstrated strong influence on contamination-related predictions.</w:t>
+      </w:r>
+    </w:p>
+    <w:p>
+      <w:r>
+        <w:t>The integration of SHAP analysis improved the interpretability of the proposed framework and enhanced trustworthiness in machine learning-driven environmental decision support systems.</w:t>
       </w:r>
     </w:p>
     <w:p/>

</xml_diff>

<commit_message>
Completed conclusion section and full paper draft structure
</commit_message>
<xml_diff>
--- a/paper/draft.docx
+++ b/paper/draft.docx
@@ -593,6 +593,39 @@
     <w:p>
       <w:r>
         <w:t>6. Conclusion</w:t>
+      </w:r>
+    </w:p>
+    <w:p>
+      <w:r>
+        <w:t>This study presented an Explainable AI-based framework for water potability prediction using machine learning techniques and environmental data analysis. The proposed system integrated data preprocessing, missing value handling, feature scaling, SMOTE-based imbalance correction, ensemble-based Random Forest classification, and SHAP explainability analysis to develop an intelligent early warning framework for drinking water assessment.</w:t>
+      </w:r>
+    </w:p>
+    <w:p>
+      <w:r>
+        <w:t>Experimental evaluation demonstrated that the Random Forest classifier significantly outperformed baseline models such as Logistic Regression and Decision Tree classifiers. The proposed framework achieved high predictive performance with strong precision, recall, F1-score, and cross-validation accuracy, indicating excellent robustness and generalization capability.</w:t>
+      </w:r>
+    </w:p>
+    <w:p>
+      <w:r>
+        <w:t xml:space="preserve">Feature importance and SHAP explainability analysis identified conductivity, total dissolved solids (TDS), and trihalomethanes as the most influential parameters affecting water potability prediction. The explainability framework improved model transparency and enabled interpretable understanding of contamination-related prediction </w:t>
+      </w:r>
+      <w:proofErr w:type="spellStart"/>
+      <w:r>
+        <w:t>behavior</w:t>
+      </w:r>
+      <w:proofErr w:type="spellEnd"/>
+      <w:r>
+        <w:t>.</w:t>
+      </w:r>
+    </w:p>
+    <w:p>
+      <w:r>
+        <w:t>The findings of this study demonstrate the potential of Explainable Artificial Intelligence for intelligent environmental monitoring and water quality assessment applications. The proposed framework can support proactive contamination detection and decision-making in water resource management systems.</w:t>
+      </w:r>
+    </w:p>
+    <w:p>
+      <w:r>
+        <w:t>Future work may include integration of real-time IoT sensor streams, temporal environmental data, multimodal monitoring systems, and deep learning architectures for large-scale real-time water quality forecasting and smart water management applications.</w:t>
       </w:r>
     </w:p>
     <w:p/>

</xml_diff>